<commit_message>
Add final GitHub screenshot
</commit_message>
<xml_diff>
--- a/module-1/Mostovoi-Assignment1_2-CSD325.docx
+++ b/module-1/Mostovoi-Assignment1_2-CSD325.docx
@@ -103,12 +103,47 @@
         <w:pStyle w:val="Heading2"/>
       </w:pPr>
       <w:r>
+        <w:lastRenderedPageBreak/>
         <w:t>GitHub Repository Screenshot</w:t>
       </w:r>
     </w:p>
     <w:p>
       <w:r>
-        <w:t>Insert a screenshot of the csd-325 GitHub repository showing the module-1 folder and Mostovoi-Assignment1_2.docx after the first push. Save the document and push the updated version to GitHub.</w:t>
+        <w:drawing>
+          <wp:inline distT="0" distB="0" distL="0" distR="0" wp14:anchorId="63AB8B04" wp14:editId="37C05367">
+            <wp:extent cx="6217920" cy="2341245"/>
+            <wp:effectExtent l="0" t="0" r="5080" b="0"/>
+            <wp:docPr id="1955720206" name="Picture 1"/>
+            <wp:cNvGraphicFramePr>
+              <a:graphicFrameLocks xmlns:a="http://schemas.openxmlformats.org/drawingml/2006/main" noChangeAspect="1"/>
+            </wp:cNvGraphicFramePr>
+            <a:graphic xmlns:a="http://schemas.openxmlformats.org/drawingml/2006/main">
+              <a:graphicData uri="http://schemas.openxmlformats.org/drawingml/2006/picture">
+                <pic:pic xmlns:pic="http://schemas.openxmlformats.org/drawingml/2006/picture">
+                  <pic:nvPicPr>
+                    <pic:cNvPr id="1955720206" name=""/>
+                    <pic:cNvPicPr/>
+                  </pic:nvPicPr>
+                  <pic:blipFill>
+                    <a:blip r:embed="rId7"/>
+                    <a:stretch>
+                      <a:fillRect/>
+                    </a:stretch>
+                  </pic:blipFill>
+                  <pic:spPr>
+                    <a:xfrm>
+                      <a:off x="0" y="0"/>
+                      <a:ext cx="6217920" cy="2341245"/>
+                    </a:xfrm>
+                    <a:prstGeom prst="rect">
+                      <a:avLst/>
+                    </a:prstGeom>
+                  </pic:spPr>
+                </pic:pic>
+              </a:graphicData>
+            </a:graphic>
+          </wp:inline>
+        </w:drawing>
       </w:r>
     </w:p>
     <w:sectPr>

</xml_diff>